<commit_message>
did the er diagram, translation, and created the tables in sql
</commit_message>
<xml_diff>
--- a/CSET155_Final/CSET 155 Final ER Document.docx
+++ b/CSET155_Final/CSET 155 Final ER Document.docx
@@ -17,8 +17,464 @@
         </w:rPr>
         <w:t>CSET 155 Final ER Document</w:t>
       </w:r>
+    </w:p>
+    <w:p>
+      <w:pPr>
+        <w:jc w:val="center"/>
+        <w:rPr>
+          <w:sz w:val="56"/>
+          <w:szCs w:val="56"/>
+          <w:u w:val="single"/>
+        </w:rPr>
+      </w:pPr>
+    </w:p>
+    <w:p>
+      <w:pPr>
+        <w:rPr>
+          <w:i/>
+          <w:sz w:val="40"/>
+          <w:szCs w:val="40"/>
+          <w:u w:val="single"/>
+        </w:rPr>
+      </w:pPr>
+      <w:proofErr w:type="spellStart"/>
+      <w:r>
+        <w:rPr>
+          <w:i/>
+          <w:sz w:val="40"/>
+          <w:szCs w:val="40"/>
+          <w:u w:val="single"/>
+        </w:rPr>
+        <w:t>Entity</w:t>
+      </w:r>
+      <w:r>
+        <w:rPr>
+          <w:i/>
+          <w:sz w:val="40"/>
+          <w:szCs w:val="40"/>
+          <w:u w:val="single"/>
+        </w:rPr>
+        <w:t>s</w:t>
+      </w:r>
+      <w:proofErr w:type="spellEnd"/>
+    </w:p>
+    <w:p>
+      <w:pPr>
+        <w:rPr>
+          <w:sz w:val="32"/>
+          <w:szCs w:val="32"/>
+          <w:u w:val="single"/>
+        </w:rPr>
+      </w:pPr>
+      <w:r>
+        <w:rPr>
+          <w:sz w:val="32"/>
+          <w:szCs w:val="32"/>
+          <w:u w:val="single"/>
+        </w:rPr>
+        <w:t xml:space="preserve">USER/ACCOUNT </w:t>
+      </w:r>
+    </w:p>
+    <w:p>
+      <w:pPr>
+        <w:rPr>
+          <w:sz w:val="32"/>
+          <w:szCs w:val="32"/>
+        </w:rPr>
+      </w:pPr>
+      <w:proofErr w:type="spellStart"/>
+      <w:r>
+        <w:rPr>
+          <w:sz w:val="32"/>
+          <w:szCs w:val="32"/>
+        </w:rPr>
+        <w:t>Account_ID</w:t>
+      </w:r>
+      <w:proofErr w:type="spellEnd"/>
+      <w:r>
+        <w:rPr>
+          <w:sz w:val="32"/>
+          <w:szCs w:val="32"/>
+        </w:rPr>
+        <w:t xml:space="preserve"> auto increment</w:t>
+      </w:r>
+      <w:r>
+        <w:rPr>
+          <w:sz w:val="32"/>
+          <w:szCs w:val="32"/>
+        </w:rPr>
+        <w:t xml:space="preserve"> int</w:t>
+      </w:r>
+      <w:r>
+        <w:rPr>
+          <w:sz w:val="32"/>
+          <w:szCs w:val="32"/>
+        </w:rPr>
+        <w:t xml:space="preserve"> PK</w:t>
+      </w:r>
+    </w:p>
+    <w:p>
+      <w:pPr>
+        <w:rPr>
+          <w:sz w:val="32"/>
+          <w:szCs w:val="32"/>
+        </w:rPr>
+      </w:pPr>
+      <w:proofErr w:type="spellStart"/>
+      <w:r>
+        <w:rPr>
+          <w:sz w:val="32"/>
+          <w:szCs w:val="32"/>
+        </w:rPr>
+        <w:t>First_name</w:t>
+      </w:r>
+      <w:proofErr w:type="spellEnd"/>
+      <w:r>
+        <w:rPr>
+          <w:sz w:val="32"/>
+          <w:szCs w:val="32"/>
+        </w:rPr>
+        <w:t xml:space="preserve"> </w:t>
+      </w:r>
+      <w:proofErr w:type="gramStart"/>
+      <w:r>
+        <w:rPr>
+          <w:sz w:val="32"/>
+          <w:szCs w:val="32"/>
+        </w:rPr>
+        <w:t>varchar(</w:t>
+      </w:r>
+      <w:proofErr w:type="gramEnd"/>
+      <w:r>
+        <w:rPr>
+          <w:sz w:val="32"/>
+          <w:szCs w:val="32"/>
+        </w:rPr>
+        <w:t>50) not null</w:t>
+      </w:r>
+    </w:p>
+    <w:p>
+      <w:pPr>
+        <w:rPr>
+          <w:sz w:val="32"/>
+          <w:szCs w:val="32"/>
+        </w:rPr>
+      </w:pPr>
+      <w:proofErr w:type="spellStart"/>
+      <w:r>
+        <w:rPr>
+          <w:sz w:val="32"/>
+          <w:szCs w:val="32"/>
+        </w:rPr>
+        <w:t>Last_name</w:t>
+      </w:r>
+      <w:proofErr w:type="spellEnd"/>
+      <w:r>
+        <w:rPr>
+          <w:sz w:val="32"/>
+          <w:szCs w:val="32"/>
+        </w:rPr>
+        <w:t xml:space="preserve"> </w:t>
+      </w:r>
+      <w:proofErr w:type="gramStart"/>
+      <w:r>
+        <w:rPr>
+          <w:sz w:val="32"/>
+          <w:szCs w:val="32"/>
+        </w:rPr>
+        <w:t>varchar(</w:t>
+      </w:r>
+      <w:proofErr w:type="gramEnd"/>
+      <w:r>
+        <w:rPr>
+          <w:sz w:val="32"/>
+          <w:szCs w:val="32"/>
+        </w:rPr>
+        <w:t>50) not null</w:t>
+      </w:r>
+    </w:p>
+    <w:p>
+      <w:pPr>
+        <w:rPr>
+          <w:sz w:val="32"/>
+          <w:szCs w:val="32"/>
+        </w:rPr>
+      </w:pPr>
+      <w:r>
+        <w:rPr>
+          <w:sz w:val="32"/>
+          <w:szCs w:val="32"/>
+        </w:rPr>
+        <w:t xml:space="preserve">Username </w:t>
+      </w:r>
+      <w:proofErr w:type="gramStart"/>
+      <w:r>
+        <w:rPr>
+          <w:sz w:val="32"/>
+          <w:szCs w:val="32"/>
+        </w:rPr>
+        <w:t>varchar(</w:t>
+      </w:r>
+      <w:proofErr w:type="gramEnd"/>
+      <w:r>
+        <w:rPr>
+          <w:sz w:val="32"/>
+          <w:szCs w:val="32"/>
+        </w:rPr>
+        <w:t>50) not null unique</w:t>
+      </w:r>
+    </w:p>
+    <w:p>
+      <w:pPr>
+        <w:rPr>
+          <w:sz w:val="32"/>
+          <w:szCs w:val="32"/>
+        </w:rPr>
+      </w:pPr>
+      <w:r>
+        <w:rPr>
+          <w:sz w:val="32"/>
+          <w:szCs w:val="32"/>
+        </w:rPr>
+        <w:t xml:space="preserve">Password </w:t>
+      </w:r>
+      <w:proofErr w:type="gramStart"/>
+      <w:r>
+        <w:rPr>
+          <w:sz w:val="32"/>
+          <w:szCs w:val="32"/>
+        </w:rPr>
+        <w:t>varchar(</w:t>
+      </w:r>
+      <w:proofErr w:type="gramEnd"/>
+      <w:r>
+        <w:rPr>
+          <w:sz w:val="32"/>
+          <w:szCs w:val="32"/>
+        </w:rPr>
+        <w:t>255) not null</w:t>
+      </w:r>
+    </w:p>
+    <w:p>
+      <w:pPr>
+        <w:rPr>
+          <w:sz w:val="32"/>
+          <w:szCs w:val="32"/>
+        </w:rPr>
+      </w:pPr>
+      <w:proofErr w:type="spellStart"/>
+      <w:r>
+        <w:rPr>
+          <w:sz w:val="32"/>
+          <w:szCs w:val="32"/>
+        </w:rPr>
+        <w:t>Email_address</w:t>
+      </w:r>
+      <w:proofErr w:type="spellEnd"/>
+      <w:r>
+        <w:rPr>
+          <w:sz w:val="32"/>
+          <w:szCs w:val="32"/>
+        </w:rPr>
+        <w:t xml:space="preserve"> </w:t>
+      </w:r>
+      <w:proofErr w:type="gramStart"/>
+      <w:r>
+        <w:rPr>
+          <w:sz w:val="32"/>
+          <w:szCs w:val="32"/>
+        </w:rPr>
+        <w:t>varchar(</w:t>
+      </w:r>
+      <w:proofErr w:type="gramEnd"/>
+      <w:r>
+        <w:rPr>
+          <w:sz w:val="32"/>
+          <w:szCs w:val="32"/>
+        </w:rPr>
+        <w:t>50) not null unique</w:t>
+      </w:r>
+    </w:p>
+    <w:p>
+      <w:pPr>
+        <w:rPr>
+          <w:sz w:val="32"/>
+          <w:szCs w:val="32"/>
+        </w:rPr>
+      </w:pPr>
+      <w:r>
+        <w:rPr>
+          <w:sz w:val="32"/>
+          <w:szCs w:val="32"/>
+        </w:rPr>
+        <w:t xml:space="preserve">Role </w:t>
+      </w:r>
+      <w:proofErr w:type="spellStart"/>
+      <w:proofErr w:type="gramStart"/>
+      <w:r>
+        <w:rPr>
+          <w:sz w:val="32"/>
+          <w:szCs w:val="32"/>
+        </w:rPr>
+        <w:t>enum</w:t>
+      </w:r>
+      <w:proofErr w:type="spellEnd"/>
+      <w:r>
+        <w:rPr>
+          <w:sz w:val="32"/>
+          <w:szCs w:val="32"/>
+        </w:rPr>
+        <w:t>(</w:t>
+      </w:r>
+      <w:proofErr w:type="gramEnd"/>
+      <w:r>
+        <w:rPr>
+          <w:sz w:val="32"/>
+          <w:szCs w:val="32"/>
+        </w:rPr>
+        <w:t>‘vendor’, ‘user’, ‘admin’)</w:t>
+      </w:r>
+    </w:p>
+    <w:p>
+      <w:pPr>
+        <w:rPr>
+          <w:sz w:val="32"/>
+          <w:szCs w:val="32"/>
+        </w:rPr>
+      </w:pPr>
+    </w:p>
+    <w:p>
+      <w:pPr>
+        <w:rPr>
+          <w:sz w:val="32"/>
+          <w:szCs w:val="32"/>
+        </w:rPr>
+      </w:pPr>
+      <w:r>
+        <w:rPr>
+          <w:sz w:val="32"/>
+          <w:szCs w:val="32"/>
+        </w:rPr>
+        <w:t>PRODUCT</w:t>
+      </w:r>
+    </w:p>
+    <w:p>
+      <w:pPr>
+        <w:rPr>
+          <w:sz w:val="32"/>
+          <w:szCs w:val="32"/>
+        </w:rPr>
+      </w:pPr>
+      <w:proofErr w:type="spellStart"/>
+      <w:r>
+        <w:rPr>
+          <w:sz w:val="32"/>
+          <w:szCs w:val="32"/>
+        </w:rPr>
+        <w:t>Product_ID</w:t>
+      </w:r>
+      <w:proofErr w:type="spellEnd"/>
+      <w:r>
+        <w:rPr>
+          <w:sz w:val="32"/>
+          <w:szCs w:val="32"/>
+        </w:rPr>
+        <w:t xml:space="preserve"> auto increment </w:t>
+      </w:r>
+      <w:r>
+        <w:rPr>
+          <w:sz w:val="32"/>
+          <w:szCs w:val="32"/>
+        </w:rPr>
+        <w:t xml:space="preserve">int </w:t>
+      </w:r>
+      <w:r>
+        <w:rPr>
+          <w:sz w:val="32"/>
+          <w:szCs w:val="32"/>
+        </w:rPr>
+        <w:t>PK</w:t>
+      </w:r>
+    </w:p>
+    <w:p>
+      <w:pPr>
+        <w:rPr>
+          <w:sz w:val="32"/>
+          <w:szCs w:val="32"/>
+        </w:rPr>
+      </w:pPr>
+      <w:r>
+        <w:rPr>
+          <w:sz w:val="32"/>
+          <w:szCs w:val="32"/>
+        </w:rPr>
+        <w:t xml:space="preserve">Name </w:t>
+      </w:r>
+      <w:proofErr w:type="gramStart"/>
+      <w:r>
+        <w:rPr>
+          <w:sz w:val="32"/>
+          <w:szCs w:val="32"/>
+        </w:rPr>
+        <w:t>varchar(</w:t>
+      </w:r>
+      <w:proofErr w:type="gramEnd"/>
+      <w:r>
+        <w:rPr>
+          <w:sz w:val="32"/>
+          <w:szCs w:val="32"/>
+        </w:rPr>
+        <w:t>50) not null</w:t>
+      </w:r>
+    </w:p>
+    <w:p>
+      <w:pPr>
+        <w:rPr>
+          <w:sz w:val="32"/>
+          <w:szCs w:val="32"/>
+        </w:rPr>
+      </w:pPr>
+      <w:r>
+        <w:rPr>
+          <w:sz w:val="32"/>
+          <w:szCs w:val="32"/>
+        </w:rPr>
+        <w:t xml:space="preserve">Description </w:t>
+      </w:r>
+      <w:proofErr w:type="gramStart"/>
+      <w:r>
+        <w:rPr>
+          <w:sz w:val="32"/>
+          <w:szCs w:val="32"/>
+        </w:rPr>
+        <w:t>varchar(</w:t>
+      </w:r>
+      <w:proofErr w:type="gramEnd"/>
+      <w:r>
+        <w:rPr>
+          <w:sz w:val="32"/>
+          <w:szCs w:val="32"/>
+        </w:rPr>
+        <w:t>500) not null</w:t>
+      </w:r>
       <w:bookmarkStart w:id="0" w:name="_GoBack"/>
       <w:bookmarkEnd w:id="0"/>
+    </w:p>
+    <w:p>
+      <w:pPr>
+        <w:rPr>
+          <w:sz w:val="32"/>
+          <w:szCs w:val="32"/>
+        </w:rPr>
+      </w:pPr>
+    </w:p>
+    <w:p>
+      <w:pPr>
+        <w:rPr>
+          <w:sz w:val="32"/>
+          <w:szCs w:val="32"/>
+        </w:rPr>
+      </w:pPr>
     </w:p>
     <w:sectPr>
       <w:pgSz w:w="12240" w:h="15840"/>
@@ -936,20 +1392,20 @@
 </file>
 
 <file path=customXml/item2.xml><?xml version="1.0" encoding="utf-8"?>
+<p:properties xmlns:p="http://schemas.microsoft.com/office/2006/metadata/properties" xmlns:xsi="http://www.w3.org/2001/XMLSchema-instance" xmlns:pc="http://schemas.microsoft.com/office/infopath/2007/PartnerControls">
+  <documentManagement>
+    <_activity xmlns="515db359-17d2-4e4f-b9e1-1936cf870c14" xsi:nil="true"/>
+  </documentManagement>
+</p:properties>
+</file>
+
+<file path=customXml/item3.xml><?xml version="1.0" encoding="utf-8"?>
 <?mso-contentType ?>
 <FormTemplates xmlns="http://schemas.microsoft.com/sharepoint/v3/contenttype/forms">
   <Display>DocumentLibraryForm</Display>
   <Edit>DocumentLibraryForm</Edit>
   <New>DocumentLibraryForm</New>
 </FormTemplates>
-</file>
-
-<file path=customXml/item3.xml><?xml version="1.0" encoding="utf-8"?>
-<p:properties xmlns:p="http://schemas.microsoft.com/office/2006/metadata/properties" xmlns:xsi="http://www.w3.org/2001/XMLSchema-instance" xmlns:pc="http://schemas.microsoft.com/office/infopath/2007/PartnerControls">
-  <documentManagement>
-    <_activity xmlns="515db359-17d2-4e4f-b9e1-1936cf870c14" xsi:nil="true"/>
-  </documentManagement>
-</p:properties>
 </file>
 
 <file path=customXml/itemProps1.xml><?xml version="1.0" encoding="utf-8"?>
@@ -971,25 +1427,25 @@
 </file>
 
 <file path=customXml/itemProps2.xml><?xml version="1.0" encoding="utf-8"?>
+<ds:datastoreItem xmlns:ds="http://schemas.openxmlformats.org/officeDocument/2006/customXml" ds:itemID="{75BAFEB7-8121-4380-80BB-E01C19C82554}">
+  <ds:schemaRefs>
+    <ds:schemaRef ds:uri="http://purl.org/dc/elements/1.1/"/>
+    <ds:schemaRef ds:uri="http://schemas.openxmlformats.org/package/2006/metadata/core-properties"/>
+    <ds:schemaRef ds:uri="515db359-17d2-4e4f-b9e1-1936cf870c14"/>
+    <ds:schemaRef ds:uri="http://schemas.microsoft.com/office/2006/documentManagement/types"/>
+    <ds:schemaRef ds:uri="http://purl.org/dc/terms/"/>
+    <ds:schemaRef ds:uri="http://schemas.microsoft.com/office/2006/metadata/properties"/>
+    <ds:schemaRef ds:uri="http://schemas.microsoft.com/office/infopath/2007/PartnerControls"/>
+    <ds:schemaRef ds:uri="http://www.w3.org/XML/1998/namespace"/>
+    <ds:schemaRef ds:uri="http://purl.org/dc/dcmitype/"/>
+  </ds:schemaRefs>
+</ds:datastoreItem>
+</file>
+
+<file path=customXml/itemProps3.xml><?xml version="1.0" encoding="utf-8"?>
 <ds:datastoreItem xmlns:ds="http://schemas.openxmlformats.org/officeDocument/2006/customXml" ds:itemID="{272713D2-271B-4D5B-BC52-B6231A370052}">
   <ds:schemaRefs>
     <ds:schemaRef ds:uri="http://schemas.microsoft.com/sharepoint/v3/contenttype/forms"/>
   </ds:schemaRefs>
 </ds:datastoreItem>
-</file>
-
-<file path=customXml/itemProps3.xml><?xml version="1.0" encoding="utf-8"?>
-<ds:datastoreItem xmlns:ds="http://schemas.openxmlformats.org/officeDocument/2006/customXml" ds:itemID="{75BAFEB7-8121-4380-80BB-E01C19C82554}">
-  <ds:schemaRefs>
-    <ds:schemaRef ds:uri="http://schemas.openxmlformats.org/package/2006/metadata/core-properties"/>
-    <ds:schemaRef ds:uri="http://purl.org/dc/terms/"/>
-    <ds:schemaRef ds:uri="http://purl.org/dc/elements/1.1/"/>
-    <ds:schemaRef ds:uri="http://schemas.microsoft.com/office/2006/documentManagement/types"/>
-    <ds:schemaRef ds:uri="http://www.w3.org/XML/1998/namespace"/>
-    <ds:schemaRef ds:uri="515db359-17d2-4e4f-b9e1-1936cf870c14"/>
-    <ds:schemaRef ds:uri="http://purl.org/dc/dcmitype/"/>
-    <ds:schemaRef ds:uri="http://schemas.microsoft.com/office/infopath/2007/PartnerControls"/>
-    <ds:schemaRef ds:uri="http://schemas.microsoft.com/office/2006/metadata/properties"/>
-  </ds:schemaRefs>
-</ds:datastoreItem>
 </file>
</xml_diff>